<commit_message>
Add four more interview questions (one per topic)
Co-Authored-By: Claude Fable 5 <noreply@anthropic.com>
Claude-Session: https://claude.ai/code/session_016XwNDrTA81BmuH2HRrakz7
</commit_message>
<xml_diff>
--- a/docs/interview-guide/נספח שאלות הריאיון - מעודכן.docx
+++ b/docs/interview-guide/נספח שאלות הריאיון - מעודכן.docx
@@ -127,7 +127,7 @@
           <w:szCs w:val="24"/>
           <w:rtl/>
         </w:rPr>
-        <w:t xml:space="preserve">המדריך כולל שאלת פתיחה, 12 שאלות בארבעה נושאים מרכזיים שנבחרו מתוך כותרות סקירת הספרות (שלוש שאלות לכל נושא), ושאלת סיכום. השאלות פתוחות, אישיות וקצרות, ואינן מכוונות לתשובה מסוימת. לכל שאלה צורפו שאלות עזר קצרות, לשימוש רק אם התשובה קצרה מדי.</w:t>
+        <w:t xml:space="preserve">המדריך כולל שאלת פתיחה, 16 שאלות בארבעה נושאים מרכזיים שנבחרו מתוך כותרות סקירת הספרות (ארבע שאלות לכל נושא), ושאלת סיכום. השאלות פתוחות, אישיות וקצרות, ואינן מכוונות לתשובה מסוימת. לכל שאלה צורפו שאלות עזר קצרות, לשימוש רק אם התשובה קצרה מדי. אם עומדים על 10 עד 12 שאלות בריאיון עצמו, אפשר להשמיט את השאלה האחרונה בכל נושא לפי זרימת השיחה.</w:t>
       </w:r>
     </w:p>
     <w:p>
@@ -365,43 +365,6 @@
     </w:p>
     <w:p>
       <w:pPr>
-        <w:pStyle w:val="Heading1"/>
-        <w:bidi/>
-        <w:spacing w:after="120" w:before="240"/>
-        <w:jc w:val="right"/>
-      </w:pPr>
-      <w:r>
-        <w:rPr>
-          <w:rFonts w:ascii="David" w:cs="David" w:eastAsia="David" w:hAnsi="David"/>
-          <w:b/>
-          <w:bCs/>
-          <w:sz w:val="30"/>
-          <w:szCs w:val="30"/>
-          <w:rtl/>
-        </w:rPr>
-        <w:t xml:space="preserve">נושא ב: הזהות החברתית של התלמידים המשולבים</w:t>
-      </w:r>
-    </w:p>
-    <w:p>
-      <w:pPr>
-        <w:bidi/>
-        <w:spacing w:after="60" w:line="360"/>
-        <w:jc w:val="both"/>
-      </w:pPr>
-      <w:r>
-        <w:rPr>
-          <w:rFonts w:ascii="David" w:cs="David" w:eastAsia="David" w:hAnsi="David"/>
-          <w:b w:val="false"/>
-          <w:bCs w:val="false"/>
-          <w:sz w:val="22"/>
-          <w:szCs w:val="22"/>
-          <w:rtl/>
-        </w:rPr>
-        <w:t xml:space="preserve">(מתוך הפרק: בניית הזהות החברתית של תלמידים עם צרכים מיוחדים)</w:t>
-      </w:r>
-    </w:p>
-    <w:p>
-      <w:pPr>
         <w:pStyle w:val="ListParagraph"/>
         <w:numPr>
           <w:ilvl w:val="0"/>
@@ -420,7 +383,7 @@
           <w:szCs w:val="24"/>
           <w:rtl/>
         </w:rPr>
-        <w:t xml:space="preserve">איך לדעתך רואים התלמידים המשולבים את מקומם בכיתה?</w:t>
+        <w:t xml:space="preserve">ספר/י לי על שיתוף הפעולה בינך ובין שאר הצוות סביב התלמידים המשולבים.</w:t>
       </w:r>
     </w:p>
     <w:p>
@@ -450,7 +413,44 @@
           <w:szCs w:val="24"/>
           <w:rtl/>
         </w:rPr>
-        <w:t xml:space="preserve">ממה את/ה למד/ה על כך? תוכל/י לתת דוגמה?</w:t>
+        <w:t xml:space="preserve">עם מי את/ה מתייעץ/ת? איך זה נראה בפועל?</w:t>
+      </w:r>
+    </w:p>
+    <w:p>
+      <w:pPr>
+        <w:pStyle w:val="Heading1"/>
+        <w:bidi/>
+        <w:spacing w:after="120" w:before="240"/>
+        <w:jc w:val="right"/>
+      </w:pPr>
+      <w:r>
+        <w:rPr>
+          <w:rFonts w:ascii="David" w:cs="David" w:eastAsia="David" w:hAnsi="David"/>
+          <w:b/>
+          <w:bCs/>
+          <w:sz w:val="30"/>
+          <w:szCs w:val="30"/>
+          <w:rtl/>
+        </w:rPr>
+        <w:t xml:space="preserve">נושא ב: הזהות החברתית של התלמידים המשולבים</w:t>
+      </w:r>
+    </w:p>
+    <w:p>
+      <w:pPr>
+        <w:bidi/>
+        <w:spacing w:after="60" w:line="360"/>
+        <w:jc w:val="both"/>
+      </w:pPr>
+      <w:r>
+        <w:rPr>
+          <w:rFonts w:ascii="David" w:cs="David" w:eastAsia="David" w:hAnsi="David"/>
+          <w:b w:val="false"/>
+          <w:bCs w:val="false"/>
+          <w:sz w:val="22"/>
+          <w:szCs w:val="22"/>
+          <w:rtl/>
+        </w:rPr>
+        <w:t xml:space="preserve">(מתוך הפרק: בניית הזהות החברתית של תלמידים עם צרכים מיוחדים)</w:t>
       </w:r>
     </w:p>
     <w:p>
@@ -473,7 +473,7 @@
           <w:szCs w:val="24"/>
           <w:rtl/>
         </w:rPr>
-        <w:t xml:space="preserve">ספר/י לי על תלמיד או תלמידה משולבים שזכורים לך במיוחד ביחסים שלהם עם ילדי הכיתה.</w:t>
+        <w:t xml:space="preserve">איך לדעתך רואים התלמידים המשולבים את מקומם בכיתה?</w:t>
       </w:r>
     </w:p>
     <w:p>
@@ -503,7 +503,7 @@
           <w:szCs w:val="24"/>
           <w:rtl/>
         </w:rPr>
-        <w:t xml:space="preserve">מה קרה שם? איך זה נגמר?</w:t>
+        <w:t xml:space="preserve">ממה את/ה למד/ה על כך? תוכל/י לתת דוגמה?</w:t>
       </w:r>
     </w:p>
     <w:p>
@@ -526,7 +526,7 @@
           <w:szCs w:val="24"/>
           <w:rtl/>
         </w:rPr>
-        <w:t xml:space="preserve">מה לדעתך משפיע על האופן שבו תלמיד משולב תופס את עצמו בבית הספר?</w:t>
+        <w:t xml:space="preserve">ספר/י לי על תלמיד או תלמידה משולבים שזכורים לך במיוחד ביחסים שלהם עם ילדי הכיתה.</w:t>
       </w:r>
     </w:p>
     <w:p>
@@ -556,44 +556,7 @@
           <w:szCs w:val="24"/>
           <w:rtl/>
         </w:rPr>
-        <w:t xml:space="preserve">מה מהדברים האלה תלוי בכיתה עצמה, לדעתך?</w:t>
-      </w:r>
-    </w:p>
-    <w:p>
-      <w:pPr>
-        <w:pStyle w:val="Heading1"/>
-        <w:bidi/>
-        <w:spacing w:after="120" w:before="240"/>
-        <w:jc w:val="right"/>
-      </w:pPr>
-      <w:r>
-        <w:rPr>
-          <w:rFonts w:ascii="David" w:cs="David" w:eastAsia="David" w:hAnsi="David"/>
-          <w:b/>
-          <w:bCs/>
-          <w:sz w:val="30"/>
-          <w:szCs w:val="30"/>
-          <w:rtl/>
-        </w:rPr>
-        <w:t xml:space="preserve">נושא ג: שייכות, רגשות וקבלה חברתית</w:t>
-      </w:r>
-    </w:p>
-    <w:p>
-      <w:pPr>
-        <w:bidi/>
-        <w:spacing w:after="60" w:line="360"/>
-        <w:jc w:val="both"/>
-      </w:pPr>
-      <w:r>
-        <w:rPr>
-          <w:rFonts w:ascii="David" w:cs="David" w:eastAsia="David" w:hAnsi="David"/>
-          <w:b w:val="false"/>
-          <w:bCs w:val="false"/>
-          <w:sz w:val="22"/>
-          <w:szCs w:val="22"/>
-          <w:rtl/>
-        </w:rPr>
-        <w:t xml:space="preserve">(מתוך הפרק: ההיבטים הרגשיים והחברתיים של תהליך ההכלה)</w:t>
+        <w:t xml:space="preserve">מה קרה שם? איך זה נגמר?</w:t>
       </w:r>
     </w:p>
     <w:p>
@@ -616,7 +579,7 @@
           <w:szCs w:val="24"/>
           <w:rtl/>
         </w:rPr>
-        <w:t xml:space="preserve">לפי מה את/ה מזהה שתלמיד משולב מרגיש שייך לכיתה, או להפך?</w:t>
+        <w:t xml:space="preserve">מה לדעתך משפיע על האופן שבו תלמיד משולב תופס את עצמו בבית הספר?</w:t>
       </w:r>
     </w:p>
     <w:p>
@@ -646,7 +609,7 @@
           <w:szCs w:val="24"/>
           <w:rtl/>
         </w:rPr>
-        <w:t xml:space="preserve">תוכל/י לתאר סימנים שאת/ה שם/ה לב אליהם?</w:t>
+        <w:t xml:space="preserve">מה מהדברים האלה תלוי בכיתה עצמה, לדעתך?</w:t>
       </w:r>
     </w:p>
     <w:p>
@@ -669,7 +632,7 @@
           <w:szCs w:val="24"/>
           <w:rtl/>
         </w:rPr>
-        <w:t xml:space="preserve">מה את/ה יכול/ה לספר על מה שקורה לתלמידים המשולבים בהפסקות ובפעילויות החברתיות?</w:t>
+        <w:t xml:space="preserve">איך ילדי הכיתה מתייחסים לתלמידים המשולבים, מניסיונך?</w:t>
       </w:r>
     </w:p>
     <w:p>
@@ -699,7 +662,44 @@
           <w:szCs w:val="24"/>
           <w:rtl/>
         </w:rPr>
-        <w:t xml:space="preserve">עם מי הם נמצאים? מה קורה כשיש פעילות כיתתית?</w:t>
+        <w:t xml:space="preserve">תוכל/י לתאר מצב שממחיש את זה?</w:t>
+      </w:r>
+    </w:p>
+    <w:p>
+      <w:pPr>
+        <w:pStyle w:val="Heading1"/>
+        <w:bidi/>
+        <w:spacing w:after="120" w:before="240"/>
+        <w:jc w:val="right"/>
+      </w:pPr>
+      <w:r>
+        <w:rPr>
+          <w:rFonts w:ascii="David" w:cs="David" w:eastAsia="David" w:hAnsi="David"/>
+          <w:b/>
+          <w:bCs/>
+          <w:sz w:val="30"/>
+          <w:szCs w:val="30"/>
+          <w:rtl/>
+        </w:rPr>
+        <w:t xml:space="preserve">נושא ג: שייכות, רגשות וקבלה חברתית</w:t>
+      </w:r>
+    </w:p>
+    <w:p>
+      <w:pPr>
+        <w:bidi/>
+        <w:spacing w:after="60" w:line="360"/>
+        <w:jc w:val="both"/>
+      </w:pPr>
+      <w:r>
+        <w:rPr>
+          <w:rFonts w:ascii="David" w:cs="David" w:eastAsia="David" w:hAnsi="David"/>
+          <w:b w:val="false"/>
+          <w:bCs w:val="false"/>
+          <w:sz w:val="22"/>
+          <w:szCs w:val="22"/>
+          <w:rtl/>
+        </w:rPr>
+        <w:t xml:space="preserve">(מתוך הפרק: ההיבטים הרגשיים והחברתיים של תהליך ההכלה)</w:t>
       </w:r>
     </w:p>
     <w:p>
@@ -722,7 +722,7 @@
           <w:szCs w:val="24"/>
           <w:rtl/>
         </w:rPr>
-        <w:t xml:space="preserve">ספר/י לי על רגע שבו תלמיד משולב התמודד עם קושי רגשי או חברתי בכיתה.</w:t>
+        <w:t xml:space="preserve">לפי מה את/ה מזהה שתלמיד משולב מרגיש שייך לכיתה, או להפך?</w:t>
       </w:r>
     </w:p>
     <w:p>
@@ -752,44 +752,7 @@
           <w:szCs w:val="24"/>
           <w:rtl/>
         </w:rPr>
-        <w:t xml:space="preserve">מה עשית באותו רגע? מה הרגשת?</w:t>
-      </w:r>
-    </w:p>
-    <w:p>
-      <w:pPr>
-        <w:pStyle w:val="Heading1"/>
-        <w:bidi/>
-        <w:spacing w:after="120" w:before="240"/>
-        <w:jc w:val="right"/>
-      </w:pPr>
-      <w:r>
-        <w:rPr>
-          <w:rFonts w:ascii="David" w:cs="David" w:eastAsia="David" w:hAnsi="David"/>
-          <w:b/>
-          <w:bCs/>
-          <w:sz w:val="30"/>
-          <w:szCs w:val="30"/>
-          <w:rtl/>
-        </w:rPr>
-        <w:t xml:space="preserve">נושא ד: תפקיד המורה, ההורים והקהילה</w:t>
-      </w:r>
-    </w:p>
-    <w:p>
-      <w:pPr>
-        <w:bidi/>
-        <w:spacing w:after="60" w:line="360"/>
-        <w:jc w:val="both"/>
-      </w:pPr>
-      <w:r>
-        <w:rPr>
-          <w:rFonts w:ascii="David" w:cs="David" w:eastAsia="David" w:hAnsi="David"/>
-          <w:b w:val="false"/>
-          <w:bCs w:val="false"/>
-          <w:sz w:val="22"/>
-          <w:szCs w:val="22"/>
-          <w:rtl/>
-        </w:rPr>
-        <w:t xml:space="preserve">(מתוך הפרק: עמדות המורים ותפקידם בקידום ההכלה)</w:t>
+        <w:t xml:space="preserve">תוכל/י לתאר סימנים שאת/ה שם/ה לב אליהם?</w:t>
       </w:r>
     </w:p>
     <w:p>
@@ -812,7 +775,7 @@
           <w:szCs w:val="24"/>
           <w:rtl/>
         </w:rPr>
-        <w:t xml:space="preserve">מה לדעתך תפקידך כמורה בחיים החברתיים של תלמיד משולב?</w:t>
+        <w:t xml:space="preserve">מה את/ה יכול/ה לספר על מה שקורה לתלמידים המשולבים בהפסקות ובפעילויות החברתיות?</w:t>
       </w:r>
     </w:p>
     <w:p>
@@ -842,7 +805,7 @@
           <w:szCs w:val="24"/>
           <w:rtl/>
         </w:rPr>
-        <w:t xml:space="preserve">אילו דברים את/ה עושה בפועל בהקשר הזה?</w:t>
+        <w:t xml:space="preserve">עם מי הם נמצאים? מה קורה כשיש פעילות כיתתית?</w:t>
       </w:r>
     </w:p>
     <w:p>
@@ -865,7 +828,7 @@
           <w:szCs w:val="24"/>
           <w:rtl/>
         </w:rPr>
-        <w:t xml:space="preserve">איך נראה הקשר שלך עם הורים של תלמידים משולבים? ספר/י לי מניסיונך.</w:t>
+        <w:t xml:space="preserve">ספר/י לי על רגע שבו תלמיד משולב התמודד עם קושי רגשי או חברתי בכיתה.</w:t>
       </w:r>
     </w:p>
     <w:p>
@@ -895,7 +858,7 @@
           <w:szCs w:val="24"/>
           <w:rtl/>
         </w:rPr>
-        <w:t xml:space="preserve">תוכל/י לתאר שיחה אחת שזכורה לך?</w:t>
+        <w:t xml:space="preserve">מה עשית באותו רגע? מה הרגשת?</w:t>
       </w:r>
     </w:p>
     <w:p>
@@ -918,7 +881,7 @@
           <w:szCs w:val="24"/>
           <w:rtl/>
         </w:rPr>
-        <w:t xml:space="preserve">מה מיוחד לדעתך בשילוב דווקא בבית ספר בחברה הבדואית בנגב?</w:t>
+        <w:t xml:space="preserve">ספר/י לי על רגע עם תלמיד משולב שהפתיע אותך.</w:t>
       </w:r>
     </w:p>
     <w:p>
@@ -948,7 +911,256 @@
           <w:szCs w:val="24"/>
           <w:rtl/>
         </w:rPr>
+        <w:t xml:space="preserve">מה קרה שם? למה זה הפתיע אותך?</w:t>
+      </w:r>
+    </w:p>
+    <w:p>
+      <w:pPr>
+        <w:pStyle w:val="Heading1"/>
+        <w:bidi/>
+        <w:spacing w:after="120" w:before="240"/>
+        <w:jc w:val="right"/>
+      </w:pPr>
+      <w:r>
+        <w:rPr>
+          <w:rFonts w:ascii="David" w:cs="David" w:eastAsia="David" w:hAnsi="David"/>
+          <w:b/>
+          <w:bCs/>
+          <w:sz w:val="30"/>
+          <w:szCs w:val="30"/>
+          <w:rtl/>
+        </w:rPr>
+        <w:t xml:space="preserve">נושא ד: תפקיד המורה, ההורים והקהילה</w:t>
+      </w:r>
+    </w:p>
+    <w:p>
+      <w:pPr>
+        <w:bidi/>
+        <w:spacing w:after="60" w:line="360"/>
+        <w:jc w:val="both"/>
+      </w:pPr>
+      <w:r>
+        <w:rPr>
+          <w:rFonts w:ascii="David" w:cs="David" w:eastAsia="David" w:hAnsi="David"/>
+          <w:b w:val="false"/>
+          <w:bCs w:val="false"/>
+          <w:sz w:val="22"/>
+          <w:szCs w:val="22"/>
+          <w:rtl/>
+        </w:rPr>
+        <w:t xml:space="preserve">(מתוך הפרק: עמדות המורים ותפקידם בקידום ההכלה)</w:t>
+      </w:r>
+    </w:p>
+    <w:p>
+      <w:pPr>
+        <w:pStyle w:val="ListParagraph"/>
+        <w:numPr>
+          <w:ilvl w:val="0"/>
+          <w:numId w:val="2"/>
+        </w:numPr>
+        <w:bidi/>
+        <w:spacing w:after="60" w:line="360"/>
+        <w:jc w:val="both"/>
+      </w:pPr>
+      <w:r>
+        <w:rPr>
+          <w:rFonts w:ascii="David" w:cs="David" w:eastAsia="David" w:hAnsi="David"/>
+          <w:b w:val="false"/>
+          <w:bCs w:val="false"/>
+          <w:sz w:val="24"/>
+          <w:szCs w:val="24"/>
+          <w:rtl/>
+        </w:rPr>
+        <w:t xml:space="preserve">מה לדעתך תפקידך כמורה בחיים החברתיים של תלמיד משולב?</w:t>
+      </w:r>
+    </w:p>
+    <w:p>
+      <w:pPr>
+        <w:bidi/>
+        <w:spacing w:after="100" w:line="360"/>
+        <w:ind w:left="1080"/>
+        <w:jc w:val="right"/>
+      </w:pPr>
+      <w:r>
+        <w:rPr>
+          <w:rFonts w:ascii="David" w:cs="David" w:eastAsia="David" w:hAnsi="David"/>
+          <w:b/>
+          <w:bCs/>
+          <w:sz w:val="24"/>
+          <w:szCs w:val="24"/>
+          <w:rtl/>
+        </w:rPr>
+        <w:t xml:space="preserve">שאלות עזר: </w:t>
+      </w:r>
+      <w:r>
+        <w:rPr>
+          <w:rFonts w:ascii="David" w:cs="David" w:eastAsia="David" w:hAnsi="David"/>
+          <w:b w:val="false"/>
+          <w:bCs w:val="false"/>
+          <w:sz w:val="24"/>
+          <w:szCs w:val="24"/>
+          <w:rtl/>
+        </w:rPr>
+        <w:t xml:space="preserve">אילו דברים את/ה עושה בפועל בהקשר הזה?</w:t>
+      </w:r>
+    </w:p>
+    <w:p>
+      <w:pPr>
+        <w:pStyle w:val="ListParagraph"/>
+        <w:numPr>
+          <w:ilvl w:val="0"/>
+          <w:numId w:val="2"/>
+        </w:numPr>
+        <w:bidi/>
+        <w:spacing w:after="60" w:line="360"/>
+        <w:jc w:val="both"/>
+      </w:pPr>
+      <w:r>
+        <w:rPr>
+          <w:rFonts w:ascii="David" w:cs="David" w:eastAsia="David" w:hAnsi="David"/>
+          <w:b w:val="false"/>
+          <w:bCs w:val="false"/>
+          <w:sz w:val="24"/>
+          <w:szCs w:val="24"/>
+          <w:rtl/>
+        </w:rPr>
+        <w:t xml:space="preserve">איך נראה הקשר שלך עם הורים של תלמידים משולבים? ספר/י לי מניסיונך.</w:t>
+      </w:r>
+    </w:p>
+    <w:p>
+      <w:pPr>
+        <w:bidi/>
+        <w:spacing w:after="100" w:line="360"/>
+        <w:ind w:left="1080"/>
+        <w:jc w:val="right"/>
+      </w:pPr>
+      <w:r>
+        <w:rPr>
+          <w:rFonts w:ascii="David" w:cs="David" w:eastAsia="David" w:hAnsi="David"/>
+          <w:b/>
+          <w:bCs/>
+          <w:sz w:val="24"/>
+          <w:szCs w:val="24"/>
+          <w:rtl/>
+        </w:rPr>
+        <w:t xml:space="preserve">שאלות עזר: </w:t>
+      </w:r>
+      <w:r>
+        <w:rPr>
+          <w:rFonts w:ascii="David" w:cs="David" w:eastAsia="David" w:hAnsi="David"/>
+          <w:b w:val="false"/>
+          <w:bCs w:val="false"/>
+          <w:sz w:val="24"/>
+          <w:szCs w:val="24"/>
+          <w:rtl/>
+        </w:rPr>
+        <w:t xml:space="preserve">תוכל/י לתאר שיחה אחת שזכורה לך?</w:t>
+      </w:r>
+    </w:p>
+    <w:p>
+      <w:pPr>
+        <w:pStyle w:val="ListParagraph"/>
+        <w:numPr>
+          <w:ilvl w:val="0"/>
+          <w:numId w:val="2"/>
+        </w:numPr>
+        <w:bidi/>
+        <w:spacing w:after="60" w:line="360"/>
+        <w:jc w:val="both"/>
+      </w:pPr>
+      <w:r>
+        <w:rPr>
+          <w:rFonts w:ascii="David" w:cs="David" w:eastAsia="David" w:hAnsi="David"/>
+          <w:b w:val="false"/>
+          <w:bCs w:val="false"/>
+          <w:sz w:val="24"/>
+          <w:szCs w:val="24"/>
+          <w:rtl/>
+        </w:rPr>
+        <w:t xml:space="preserve">מה מיוחד לדעתך בשילוב דווקא בבית ספר בחברה הבדואית בנגב?</w:t>
+      </w:r>
+    </w:p>
+    <w:p>
+      <w:pPr>
+        <w:bidi/>
+        <w:spacing w:after="100" w:line="360"/>
+        <w:ind w:left="1080"/>
+        <w:jc w:val="right"/>
+      </w:pPr>
+      <w:r>
+        <w:rPr>
+          <w:rFonts w:ascii="David" w:cs="David" w:eastAsia="David" w:hAnsi="David"/>
+          <w:b/>
+          <w:bCs/>
+          <w:sz w:val="24"/>
+          <w:szCs w:val="24"/>
+          <w:rtl/>
+        </w:rPr>
+        <w:t xml:space="preserve">שאלות עזר: </w:t>
+      </w:r>
+      <w:r>
+        <w:rPr>
+          <w:rFonts w:ascii="David" w:cs="David" w:eastAsia="David" w:hAnsi="David"/>
+          <w:b w:val="false"/>
+          <w:bCs w:val="false"/>
+          <w:sz w:val="24"/>
+          <w:szCs w:val="24"/>
+          <w:rtl/>
+        </w:rPr>
         <w:t xml:space="preserve">איך הקהילה מתייחסת לזה? מה היית משנה אם אפשר?</w:t>
+      </w:r>
+    </w:p>
+    <w:p>
+      <w:pPr>
+        <w:pStyle w:val="ListParagraph"/>
+        <w:numPr>
+          <w:ilvl w:val="0"/>
+          <w:numId w:val="2"/>
+        </w:numPr>
+        <w:bidi/>
+        <w:spacing w:after="60" w:line="360"/>
+        <w:jc w:val="both"/>
+      </w:pPr>
+      <w:r>
+        <w:rPr>
+          <w:rFonts w:ascii="David" w:cs="David" w:eastAsia="David" w:hAnsi="David"/>
+          <w:b w:val="false"/>
+          <w:bCs w:val="false"/>
+          <w:sz w:val="24"/>
+          <w:szCs w:val="24"/>
+          <w:rtl/>
+        </w:rPr>
+        <w:t xml:space="preserve">מה היית אומר/ת למורה שמתחיל/ה עכשיו ללמד בכיתה משלבת?</w:t>
+      </w:r>
+    </w:p>
+    <w:p>
+      <w:pPr>
+        <w:bidi/>
+        <w:spacing w:after="100" w:line="360"/>
+        <w:ind w:left="1080"/>
+        <w:jc w:val="right"/>
+      </w:pPr>
+      <w:r>
+        <w:rPr>
+          <w:rFonts w:ascii="David" w:cs="David" w:eastAsia="David" w:hAnsi="David"/>
+          <w:b/>
+          <w:bCs/>
+          <w:sz w:val="24"/>
+          <w:szCs w:val="24"/>
+          <w:rtl/>
+        </w:rPr>
+        <w:t xml:space="preserve">שאלות עזר: </w:t>
+      </w:r>
+      <w:r>
+        <w:rPr>
+          <w:rFonts w:ascii="David" w:cs="David" w:eastAsia="David" w:hAnsi="David"/>
+          <w:b w:val="false"/>
+          <w:bCs w:val="false"/>
+          <w:sz w:val="24"/>
+          <w:szCs w:val="24"/>
+          <w:rtl/>
+        </w:rPr>
+        <w:t xml:space="preserve">מה למדת בעצמך רק מתוך הניסיון?</w:t>
       </w:r>
     </w:p>
     <w:p>

</xml_diff>